<commit_message>
Fix Template Feat: UI, Logo, Bg
</commit_message>
<xml_diff>
--- a/template/CERTIFICATION-COLLEGE.docx
+++ b/template/CERTIFICATION-COLLEGE.docx
@@ -260,16 +260,7 @@
           <w:szCs w:val="24"/>
           <w:lang w:val="en-US"/>
         </w:rPr>
-        <w:t>{{HOURS_RENDERED}}-</w:t>
-      </w:r>
-      <w:r>
-        <w:rPr>
-          <w:rFonts w:ascii="Bookman Old Style" w:eastAsia="Bookman Old Style" w:hAnsi="Bookman Old Style" w:cs="Bookman Old Style"/>
-          <w:sz w:val="24"/>
-          <w:szCs w:val="24"/>
-          <w:lang w:val="en-US"/>
-        </w:rPr>
-        <w:t xml:space="preserve">hours of On-the-Job Training in this Municipality particularly assigned at the </w:t>
+        <w:t>{{HOURS_RENDERED}}</w:t>
       </w:r>
       <w:r>
         <w:rPr>
@@ -280,16 +271,7 @@
           <w:szCs w:val="24"/>
           <w:lang w:val="en-US"/>
         </w:rPr>
-        <w:t>{{DEPARTMENT}}</w:t>
-      </w:r>
-      <w:r>
-        <w:rPr>
-          <w:rFonts w:ascii="Bookman Old Style" w:eastAsia="Bookman Old Style" w:hAnsi="Bookman Old Style" w:cs="Bookman Old Style"/>
-          <w:sz w:val="24"/>
-          <w:szCs w:val="24"/>
-          <w:lang w:val="en-US"/>
-        </w:rPr>
-        <w:t xml:space="preserve"> from </w:t>
+        <w:t xml:space="preserve"> </w:t>
       </w:r>
       <w:r>
         <w:rPr>
@@ -300,16 +282,16 @@
           <w:szCs w:val="24"/>
           <w:lang w:val="en-US"/>
         </w:rPr>
-        <w:t>{{START_DATE}}</w:t>
-      </w:r>
-      <w:r>
-        <w:rPr>
-          <w:rFonts w:ascii="Bookman Old Style" w:eastAsia="Bookman Old Style" w:hAnsi="Bookman Old Style" w:cs="Bookman Old Style"/>
-          <w:sz w:val="24"/>
-          <w:szCs w:val="24"/>
-          <w:lang w:val="en-US"/>
-        </w:rPr>
-        <w:t xml:space="preserve"> to </w:t>
+        <w:t>hours</w:t>
+      </w:r>
+      <w:r>
+        <w:rPr>
+          <w:rFonts w:ascii="Bookman Old Style" w:eastAsia="Bookman Old Style" w:hAnsi="Bookman Old Style" w:cs="Bookman Old Style"/>
+          <w:sz w:val="24"/>
+          <w:szCs w:val="24"/>
+          <w:lang w:val="en-US"/>
+        </w:rPr>
+        <w:t xml:space="preserve"> of On-the-Job Training in this Municipality particularly assigned at the </w:t>
       </w:r>
       <w:r>
         <w:rPr>
@@ -320,42 +302,16 @@
           <w:szCs w:val="24"/>
           <w:lang w:val="en-US"/>
         </w:rPr>
-        <w:t>{{END_DATE}}.</w:t>
-      </w:r>
-    </w:p>
-    <w:p>
-      <w:pPr>
-        <w:spacing w:after="0" w:line="240" w:lineRule="auto"/>
-        <w:ind w:left="720"/>
-        <w:jc w:val="both"/>
-        <w:rPr>
-          <w:rFonts w:ascii="Bookman Old Style" w:eastAsia="Bookman Old Style" w:hAnsi="Bookman Old Style" w:cs="Bookman Old Style"/>
-          <w:sz w:val="24"/>
-          <w:szCs w:val="24"/>
-          <w:lang w:val="en-US"/>
-        </w:rPr>
-      </w:pPr>
-    </w:p>
-    <w:p>
-      <w:pPr>
-        <w:spacing w:after="0" w:line="240" w:lineRule="auto"/>
-        <w:ind w:firstLine="720"/>
-        <w:jc w:val="both"/>
-        <w:rPr>
-          <w:rFonts w:ascii="Bookman Old Style" w:eastAsia="Bookman Old Style" w:hAnsi="Bookman Old Style" w:cs="Bookman Old Style"/>
-          <w:sz w:val="24"/>
-          <w:szCs w:val="24"/>
-          <w:lang w:val="en-US"/>
-        </w:rPr>
-      </w:pPr>
-      <w:r>
-        <w:rPr>
-          <w:rFonts w:ascii="Bookman Old Style" w:eastAsia="Bookman Old Style" w:hAnsi="Bookman Old Style" w:cs="Bookman Old Style"/>
-          <w:sz w:val="24"/>
-          <w:szCs w:val="24"/>
-          <w:lang w:val="en-US"/>
-        </w:rPr>
-        <w:t xml:space="preserve">This certification is issued upon the request of the above-named person for {{PRONOUN_HER_HIS}} </w:t>
+        <w:t>{{DEPARTMENT}}</w:t>
+      </w:r>
+      <w:r>
+        <w:rPr>
+          <w:rFonts w:ascii="Bookman Old Style" w:eastAsia="Bookman Old Style" w:hAnsi="Bookman Old Style" w:cs="Bookman Old Style"/>
+          <w:sz w:val="24"/>
+          <w:szCs w:val="24"/>
+          <w:lang w:val="en-US"/>
+        </w:rPr>
+        <w:t xml:space="preserve"> from </w:t>
       </w:r>
       <w:r>
         <w:rPr>
@@ -366,177 +322,62 @@
           <w:szCs w:val="24"/>
           <w:lang w:val="en-US"/>
         </w:rPr>
-        <w:t>On-the-Job Training Requirement</w:t>
-      </w:r>
-      <w:r>
-        <w:rPr>
-          <w:rFonts w:ascii="Bookman Old Style" w:eastAsia="Bookman Old Style" w:hAnsi="Bookman Old Style" w:cs="Bookman Old Style"/>
-          <w:sz w:val="24"/>
-          <w:szCs w:val="24"/>
-          <w:lang w:val="en-US"/>
-        </w:rPr>
-        <w:t xml:space="preserve"> only.</w:t>
-      </w:r>
-    </w:p>
-    <w:p>
-      <w:pPr>
-        <w:spacing w:after="0" w:line="240" w:lineRule="auto"/>
-        <w:ind w:left="720"/>
-        <w:jc w:val="both"/>
-        <w:rPr>
-          <w:rFonts w:ascii="Bookman Old Style" w:eastAsia="Bookman Old Style" w:hAnsi="Bookman Old Style" w:cs="Bookman Old Style"/>
-          <w:sz w:val="24"/>
-          <w:szCs w:val="24"/>
-          <w:lang w:val="en-US"/>
-        </w:rPr>
-      </w:pPr>
-    </w:p>
-    <w:p>
-      <w:pPr>
-        <w:spacing w:after="0" w:line="240" w:lineRule="auto"/>
-        <w:ind w:left="720"/>
-        <w:jc w:val="both"/>
-        <w:rPr>
-          <w:rFonts w:ascii="Bookman Old Style" w:eastAsia="Bookman Old Style" w:hAnsi="Bookman Old Style" w:cs="Bookman Old Style"/>
-          <w:sz w:val="24"/>
-          <w:szCs w:val="24"/>
-          <w:lang w:val="en-US"/>
-        </w:rPr>
-      </w:pPr>
-      <w:r>
-        <w:rPr>
-          <w:rFonts w:ascii="Bookman Old Style" w:eastAsia="Bookman Old Style" w:hAnsi="Bookman Old Style" w:cs="Bookman Old Style"/>
-          <w:sz w:val="24"/>
-          <w:szCs w:val="24"/>
-          <w:lang w:val="en-US"/>
-        </w:rPr>
-        <w:t>ISSUED this {{ISSUED_DATE}} at Rodriguez, Rizal.</w:t>
-      </w:r>
-    </w:p>
-    <w:p>
-      <w:pPr>
-        <w:spacing w:after="0" w:line="240" w:lineRule="auto"/>
-        <w:ind w:left="720"/>
-        <w:jc w:val="both"/>
-        <w:rPr>
-          <w:rFonts w:ascii="Bookman Old Style" w:eastAsia="Bookman Old Style" w:hAnsi="Bookman Old Style" w:cs="Bookman Old Style"/>
-          <w:sz w:val="24"/>
-          <w:szCs w:val="24"/>
-        </w:rPr>
-      </w:pPr>
-      <w:r>
-        <w:rPr>
-          <w:rFonts w:ascii="Bookman Old Style" w:eastAsia="Bookman Old Style" w:hAnsi="Bookman Old Style" w:cs="Bookman Old Style"/>
-          <w:sz w:val="24"/>
-          <w:szCs w:val="24"/>
-        </w:rPr>
-        <w:t xml:space="preserve"> </w:t>
-      </w:r>
-    </w:p>
-    <w:p>
-      <w:pPr>
-        <w:spacing w:after="0" w:line="240" w:lineRule="auto"/>
-        <w:ind w:left="720"/>
-        <w:jc w:val="both"/>
-        <w:rPr>
-          <w:rFonts w:ascii="Bookman Old Style" w:eastAsia="Bookman Old Style" w:hAnsi="Bookman Old Style" w:cs="Bookman Old Style"/>
-          <w:sz w:val="24"/>
-          <w:szCs w:val="24"/>
-        </w:rPr>
-      </w:pPr>
-      <w:r>
-        <w:rPr>
-          <w:rFonts w:ascii="Bookman Old Style" w:eastAsia="Bookman Old Style" w:hAnsi="Bookman Old Style" w:cs="Bookman Old Style"/>
-          <w:sz w:val="24"/>
-          <w:szCs w:val="24"/>
-        </w:rPr>
-        <w:t xml:space="preserve"> </w:t>
-      </w:r>
-    </w:p>
-    <w:p>
-      <w:pPr>
-        <w:spacing w:after="0" w:line="240" w:lineRule="auto"/>
-        <w:ind w:left="720"/>
-        <w:jc w:val="both"/>
-        <w:rPr>
-          <w:rFonts w:ascii="Bookman Old Style" w:eastAsia="Bookman Old Style" w:hAnsi="Bookman Old Style" w:cs="Bookman Old Style"/>
-          <w:sz w:val="24"/>
-          <w:szCs w:val="24"/>
-        </w:rPr>
-      </w:pPr>
-      <w:r>
-        <w:rPr>
-          <w:rFonts w:ascii="Bookman Old Style" w:eastAsia="Bookman Old Style" w:hAnsi="Bookman Old Style" w:cs="Bookman Old Style"/>
-          <w:sz w:val="24"/>
-          <w:szCs w:val="24"/>
-        </w:rPr>
-        <w:t xml:space="preserve"> </w:t>
-      </w:r>
-    </w:p>
-    <w:p>
-      <w:pPr>
-        <w:spacing w:after="0" w:line="240" w:lineRule="auto"/>
-        <w:ind w:left="720"/>
-        <w:jc w:val="both"/>
-        <w:rPr>
-          <w:rFonts w:ascii="Bookman Old Style" w:eastAsia="Bookman Old Style" w:hAnsi="Bookman Old Style" w:cs="Bookman Old Style"/>
-          <w:sz w:val="24"/>
-          <w:szCs w:val="24"/>
-        </w:rPr>
-      </w:pPr>
-      <w:r>
-        <w:rPr>
-          <w:rFonts w:ascii="Bookman Old Style" w:eastAsia="Bookman Old Style" w:hAnsi="Bookman Old Style" w:cs="Bookman Old Style"/>
-          <w:sz w:val="24"/>
-          <w:szCs w:val="24"/>
-        </w:rPr>
-        <w:t xml:space="preserve"> </w:t>
-      </w:r>
-    </w:p>
-    <w:p>
-      <w:pPr>
-        <w:spacing w:after="0" w:line="240" w:lineRule="auto"/>
-        <w:ind w:left="720"/>
-        <w:jc w:val="both"/>
-        <w:rPr>
-          <w:rFonts w:ascii="Bookman Old Style" w:eastAsia="Bookman Old Style" w:hAnsi="Bookman Old Style" w:cs="Bookman Old Style"/>
-          <w:sz w:val="24"/>
-          <w:szCs w:val="24"/>
-        </w:rPr>
-      </w:pPr>
-    </w:p>
-    <w:p>
-      <w:pPr>
-        <w:spacing w:after="0" w:line="240" w:lineRule="auto"/>
-        <w:ind w:left="720"/>
-        <w:jc w:val="both"/>
-        <w:rPr>
-          <w:rFonts w:ascii="Bookman Old Style" w:eastAsia="Bookman Old Style" w:hAnsi="Bookman Old Style" w:cs="Bookman Old Style"/>
-          <w:sz w:val="24"/>
-          <w:szCs w:val="24"/>
-        </w:rPr>
-      </w:pPr>
-    </w:p>
-    <w:p>
-      <w:pPr>
-        <w:spacing w:after="0" w:line="240" w:lineRule="auto"/>
-        <w:ind w:left="720"/>
-        <w:jc w:val="both"/>
+        <w:t>{{START_DATE}}</w:t>
+      </w:r>
+      <w:r>
+        <w:rPr>
+          <w:rFonts w:ascii="Bookman Old Style" w:eastAsia="Bookman Old Style" w:hAnsi="Bookman Old Style" w:cs="Bookman Old Style"/>
+          <w:sz w:val="24"/>
+          <w:szCs w:val="24"/>
+          <w:lang w:val="en-US"/>
+        </w:rPr>
+        <w:t xml:space="preserve"> to </w:t>
+      </w:r>
+      <w:r>
         <w:rPr>
           <w:rFonts w:ascii="Bookman Old Style" w:eastAsia="Bookman Old Style" w:hAnsi="Bookman Old Style" w:cs="Bookman Old Style"/>
           <w:b/>
           <w:bCs/>
           <w:sz w:val="24"/>
           <w:szCs w:val="24"/>
-        </w:rPr>
-      </w:pPr>
-      <w:r>
-        <w:rPr>
-          <w:rFonts w:ascii="Bookman Old Style" w:eastAsia="Bookman Old Style" w:hAnsi="Bookman Old Style" w:cs="Bookman Old Style"/>
-          <w:sz w:val="24"/>
-          <w:szCs w:val="24"/>
-        </w:rPr>
-        <w:t xml:space="preserve">                                 </w:t>
+          <w:lang w:val="en-US"/>
+        </w:rPr>
+        <w:t>{{END_DATE}}.</w:t>
+      </w:r>
+    </w:p>
+    <w:p>
+      <w:pPr>
+        <w:spacing w:after="0" w:line="240" w:lineRule="auto"/>
+        <w:ind w:left="720"/>
+        <w:jc w:val="both"/>
+        <w:rPr>
+          <w:rFonts w:ascii="Bookman Old Style" w:eastAsia="Bookman Old Style" w:hAnsi="Bookman Old Style" w:cs="Bookman Old Style"/>
+          <w:sz w:val="24"/>
+          <w:szCs w:val="24"/>
+          <w:lang w:val="en-US"/>
+        </w:rPr>
+      </w:pPr>
+    </w:p>
+    <w:p>
+      <w:pPr>
+        <w:spacing w:after="0" w:line="240" w:lineRule="auto"/>
+        <w:ind w:firstLine="720"/>
+        <w:jc w:val="both"/>
+        <w:rPr>
+          <w:rFonts w:ascii="Bookman Old Style" w:eastAsia="Bookman Old Style" w:hAnsi="Bookman Old Style" w:cs="Bookman Old Style"/>
+          <w:sz w:val="24"/>
+          <w:szCs w:val="24"/>
+          <w:lang w:val="en-US"/>
+        </w:rPr>
+      </w:pPr>
+      <w:r>
+        <w:rPr>
+          <w:rFonts w:ascii="Bookman Old Style" w:eastAsia="Bookman Old Style" w:hAnsi="Bookman Old Style" w:cs="Bookman Old Style"/>
+          <w:sz w:val="24"/>
+          <w:szCs w:val="24"/>
+          <w:lang w:val="en-US"/>
+        </w:rPr>
+        <w:t xml:space="preserve">This certification is issued upon the request of the above-named person for {{PRONOUN_HER_HIS}} </w:t>
       </w:r>
       <w:r>
         <w:rPr>
@@ -545,6 +386,187 @@
           <w:bCs/>
           <w:sz w:val="24"/>
           <w:szCs w:val="24"/>
+          <w:lang w:val="en-US"/>
+        </w:rPr>
+        <w:t>On-the-Job Training Requirement</w:t>
+      </w:r>
+      <w:r>
+        <w:rPr>
+          <w:rFonts w:ascii="Bookman Old Style" w:eastAsia="Bookman Old Style" w:hAnsi="Bookman Old Style" w:cs="Bookman Old Style"/>
+          <w:sz w:val="24"/>
+          <w:szCs w:val="24"/>
+          <w:lang w:val="en-US"/>
+        </w:rPr>
+        <w:t xml:space="preserve"> only.</w:t>
+      </w:r>
+    </w:p>
+    <w:p>
+      <w:pPr>
+        <w:spacing w:after="0" w:line="240" w:lineRule="auto"/>
+        <w:ind w:left="720"/>
+        <w:jc w:val="both"/>
+        <w:rPr>
+          <w:rFonts w:ascii="Bookman Old Style" w:eastAsia="Bookman Old Style" w:hAnsi="Bookman Old Style" w:cs="Bookman Old Style"/>
+          <w:sz w:val="24"/>
+          <w:szCs w:val="24"/>
+          <w:lang w:val="en-US"/>
+        </w:rPr>
+      </w:pPr>
+    </w:p>
+    <w:p>
+      <w:pPr>
+        <w:spacing w:after="0" w:line="240" w:lineRule="auto"/>
+        <w:ind w:left="720"/>
+        <w:jc w:val="both"/>
+        <w:rPr>
+          <w:rFonts w:ascii="Bookman Old Style" w:eastAsia="Bookman Old Style" w:hAnsi="Bookman Old Style" w:cs="Bookman Old Style"/>
+          <w:sz w:val="24"/>
+          <w:szCs w:val="24"/>
+          <w:lang w:val="en-US"/>
+        </w:rPr>
+      </w:pPr>
+      <w:r>
+        <w:rPr>
+          <w:rFonts w:ascii="Bookman Old Style" w:eastAsia="Bookman Old Style" w:hAnsi="Bookman Old Style" w:cs="Bookman Old Style"/>
+          <w:sz w:val="24"/>
+          <w:szCs w:val="24"/>
+          <w:lang w:val="en-US"/>
+        </w:rPr>
+        <w:t>ISSUED this {{ISSUED_DATE}} at Rodriguez, Rizal.</w:t>
+      </w:r>
+    </w:p>
+    <w:p>
+      <w:pPr>
+        <w:spacing w:after="0" w:line="240" w:lineRule="auto"/>
+        <w:ind w:left="720"/>
+        <w:jc w:val="both"/>
+        <w:rPr>
+          <w:rFonts w:ascii="Bookman Old Style" w:eastAsia="Bookman Old Style" w:hAnsi="Bookman Old Style" w:cs="Bookman Old Style"/>
+          <w:sz w:val="24"/>
+          <w:szCs w:val="24"/>
+        </w:rPr>
+      </w:pPr>
+      <w:r>
+        <w:rPr>
+          <w:rFonts w:ascii="Bookman Old Style" w:eastAsia="Bookman Old Style" w:hAnsi="Bookman Old Style" w:cs="Bookman Old Style"/>
+          <w:sz w:val="24"/>
+          <w:szCs w:val="24"/>
+        </w:rPr>
+        <w:t xml:space="preserve"> </w:t>
+      </w:r>
+    </w:p>
+    <w:p>
+      <w:pPr>
+        <w:spacing w:after="0" w:line="240" w:lineRule="auto"/>
+        <w:ind w:left="720"/>
+        <w:jc w:val="both"/>
+        <w:rPr>
+          <w:rFonts w:ascii="Bookman Old Style" w:eastAsia="Bookman Old Style" w:hAnsi="Bookman Old Style" w:cs="Bookman Old Style"/>
+          <w:sz w:val="24"/>
+          <w:szCs w:val="24"/>
+        </w:rPr>
+      </w:pPr>
+      <w:r>
+        <w:rPr>
+          <w:rFonts w:ascii="Bookman Old Style" w:eastAsia="Bookman Old Style" w:hAnsi="Bookman Old Style" w:cs="Bookman Old Style"/>
+          <w:sz w:val="24"/>
+          <w:szCs w:val="24"/>
+        </w:rPr>
+        <w:t xml:space="preserve"> </w:t>
+      </w:r>
+    </w:p>
+    <w:p>
+      <w:pPr>
+        <w:spacing w:after="0" w:line="240" w:lineRule="auto"/>
+        <w:ind w:left="720"/>
+        <w:jc w:val="both"/>
+        <w:rPr>
+          <w:rFonts w:ascii="Bookman Old Style" w:eastAsia="Bookman Old Style" w:hAnsi="Bookman Old Style" w:cs="Bookman Old Style"/>
+          <w:sz w:val="24"/>
+          <w:szCs w:val="24"/>
+        </w:rPr>
+      </w:pPr>
+      <w:r>
+        <w:rPr>
+          <w:rFonts w:ascii="Bookman Old Style" w:eastAsia="Bookman Old Style" w:hAnsi="Bookman Old Style" w:cs="Bookman Old Style"/>
+          <w:sz w:val="24"/>
+          <w:szCs w:val="24"/>
+        </w:rPr>
+        <w:t xml:space="preserve"> </w:t>
+      </w:r>
+    </w:p>
+    <w:p>
+      <w:pPr>
+        <w:spacing w:after="0" w:line="240" w:lineRule="auto"/>
+        <w:ind w:left="720"/>
+        <w:jc w:val="both"/>
+        <w:rPr>
+          <w:rFonts w:ascii="Bookman Old Style" w:eastAsia="Bookman Old Style" w:hAnsi="Bookman Old Style" w:cs="Bookman Old Style"/>
+          <w:sz w:val="24"/>
+          <w:szCs w:val="24"/>
+        </w:rPr>
+      </w:pPr>
+      <w:r>
+        <w:rPr>
+          <w:rFonts w:ascii="Bookman Old Style" w:eastAsia="Bookman Old Style" w:hAnsi="Bookman Old Style" w:cs="Bookman Old Style"/>
+          <w:sz w:val="24"/>
+          <w:szCs w:val="24"/>
+        </w:rPr>
+        <w:t xml:space="preserve"> </w:t>
+      </w:r>
+    </w:p>
+    <w:p>
+      <w:pPr>
+        <w:spacing w:after="0" w:line="240" w:lineRule="auto"/>
+        <w:ind w:left="720"/>
+        <w:jc w:val="both"/>
+        <w:rPr>
+          <w:rFonts w:ascii="Bookman Old Style" w:eastAsia="Bookman Old Style" w:hAnsi="Bookman Old Style" w:cs="Bookman Old Style"/>
+          <w:sz w:val="24"/>
+          <w:szCs w:val="24"/>
+        </w:rPr>
+      </w:pPr>
+    </w:p>
+    <w:p>
+      <w:pPr>
+        <w:spacing w:after="0" w:line="240" w:lineRule="auto"/>
+        <w:ind w:left="720"/>
+        <w:jc w:val="both"/>
+        <w:rPr>
+          <w:rFonts w:ascii="Bookman Old Style" w:eastAsia="Bookman Old Style" w:hAnsi="Bookman Old Style" w:cs="Bookman Old Style"/>
+          <w:sz w:val="24"/>
+          <w:szCs w:val="24"/>
+        </w:rPr>
+      </w:pPr>
+    </w:p>
+    <w:p>
+      <w:pPr>
+        <w:spacing w:after="0" w:line="240" w:lineRule="auto"/>
+        <w:ind w:left="720"/>
+        <w:jc w:val="both"/>
+        <w:rPr>
+          <w:rFonts w:ascii="Bookman Old Style" w:eastAsia="Bookman Old Style" w:hAnsi="Bookman Old Style" w:cs="Bookman Old Style"/>
+          <w:b/>
+          <w:bCs/>
+          <w:sz w:val="24"/>
+          <w:szCs w:val="24"/>
+        </w:rPr>
+      </w:pPr>
+      <w:r>
+        <w:rPr>
+          <w:rFonts w:ascii="Bookman Old Style" w:eastAsia="Bookman Old Style" w:hAnsi="Bookman Old Style" w:cs="Bookman Old Style"/>
+          <w:sz w:val="24"/>
+          <w:szCs w:val="24"/>
+        </w:rPr>
+        <w:t xml:space="preserve">                                 </w:t>
+      </w:r>
+      <w:r>
+        <w:rPr>
+          <w:rFonts w:ascii="Bookman Old Style" w:eastAsia="Bookman Old Style" w:hAnsi="Bookman Old Style" w:cs="Bookman Old Style"/>
+          <w:b/>
+          <w:bCs/>
+          <w:sz w:val="24"/>
+          <w:szCs w:val="24"/>
         </w:rPr>
         <w:t>MARIETTA THOMASINA ANGELINE T. PORIO</w:t>
       </w:r>
@@ -862,654 +884,6 @@
           <w:szCs w:val="24"/>
         </w:rPr>
       </w:pPr>
-      <w:r>
-        <w:br w:type="page"/>
-      </w:r>
-    </w:p>
-    <w:p>
-      <w:pPr>
-        <w:spacing w:after="0" w:line="240" w:lineRule="auto"/>
-        <w:jc w:val="both"/>
-        <w:rPr>
-          <w:rFonts w:ascii="Bookman Old Style" w:eastAsia="Bookman Old Style" w:hAnsi="Bookman Old Style" w:cs="Bookman Old Style"/>
-          <w:b/>
-          <w:bCs/>
-          <w:sz w:val="36"/>
-          <w:szCs w:val="36"/>
-        </w:rPr>
-      </w:pPr>
-    </w:p>
-    <w:p>
-      <w:pPr>
-        <w:spacing w:after="0" w:line="240" w:lineRule="auto"/>
-        <w:jc w:val="both"/>
-        <w:rPr>
-          <w:rFonts w:ascii="Bookman Old Style" w:eastAsia="Bookman Old Style" w:hAnsi="Bookman Old Style" w:cs="Bookman Old Style"/>
-          <w:b/>
-          <w:bCs/>
-          <w:sz w:val="36"/>
-          <w:szCs w:val="36"/>
-        </w:rPr>
-      </w:pPr>
-    </w:p>
-    <w:p>
-      <w:pPr>
-        <w:spacing w:after="0" w:line="240" w:lineRule="auto"/>
-        <w:rPr>
-          <w:rFonts w:ascii="Bookman Old Style" w:eastAsia="Bookman Old Style" w:hAnsi="Bookman Old Style" w:cs="Bookman Old Style"/>
-          <w:b/>
-          <w:bCs/>
-          <w:sz w:val="36"/>
-          <w:szCs w:val="36"/>
-        </w:rPr>
-      </w:pPr>
-    </w:p>
-    <w:p>
-      <w:pPr>
-        <w:spacing w:after="0" w:line="240" w:lineRule="auto"/>
-        <w:jc w:val="center"/>
-        <w:rPr>
-          <w:rFonts w:ascii="Bookman Old Style" w:eastAsia="Bookman Old Style" w:hAnsi="Bookman Old Style" w:cs="Bookman Old Style"/>
-          <w:b/>
-          <w:bCs/>
-          <w:sz w:val="36"/>
-          <w:szCs w:val="36"/>
-        </w:rPr>
-      </w:pPr>
-    </w:p>
-    <w:p>
-      <w:pPr>
-        <w:spacing w:after="0" w:line="240" w:lineRule="auto"/>
-        <w:jc w:val="center"/>
-        <w:rPr>
-          <w:rFonts w:ascii="Bookman Old Style" w:eastAsia="Bookman Old Style" w:hAnsi="Bookman Old Style" w:cs="Bookman Old Style"/>
-          <w:b/>
-          <w:bCs/>
-          <w:sz w:val="36"/>
-          <w:szCs w:val="36"/>
-        </w:rPr>
-      </w:pPr>
-    </w:p>
-    <w:p>
-      <w:pPr>
-        <w:spacing w:after="0" w:line="240" w:lineRule="auto"/>
-        <w:jc w:val="center"/>
-        <w:rPr>
-          <w:rFonts w:ascii="Bookman Old Style" w:eastAsia="Bookman Old Style" w:hAnsi="Bookman Old Style" w:cs="Bookman Old Style"/>
-          <w:b/>
-          <w:bCs/>
-          <w:sz w:val="36"/>
-          <w:szCs w:val="36"/>
-        </w:rPr>
-      </w:pPr>
-      <w:r>
-        <w:rPr>
-          <w:rFonts w:ascii="Bookman Old Style" w:eastAsia="Bookman Old Style" w:hAnsi="Bookman Old Style" w:cs="Bookman Old Style"/>
-          <w:b/>
-          <w:bCs/>
-          <w:sz w:val="36"/>
-          <w:szCs w:val="36"/>
-        </w:rPr>
-        <w:t>C E R T I F I C A T I O N</w:t>
-      </w:r>
-    </w:p>
-    <w:p>
-      <w:pPr>
-        <w:spacing w:after="0" w:line="240" w:lineRule="auto"/>
-        <w:jc w:val="center"/>
-        <w:rPr>
-          <w:rFonts w:ascii="Bookman Old Style" w:eastAsia="Bookman Old Style" w:hAnsi="Bookman Old Style" w:cs="Bookman Old Style"/>
-          <w:b/>
-          <w:bCs/>
-          <w:sz w:val="36"/>
-          <w:szCs w:val="36"/>
-        </w:rPr>
-      </w:pPr>
-    </w:p>
-    <w:p>
-      <w:pPr>
-        <w:spacing w:after="0" w:line="240" w:lineRule="auto"/>
-        <w:rPr>
-          <w:rFonts w:ascii="Bookman Old Style" w:eastAsia="Bookman Old Style" w:hAnsi="Bookman Old Style" w:cs="Bookman Old Style"/>
-          <w:sz w:val="24"/>
-          <w:szCs w:val="24"/>
-        </w:rPr>
-      </w:pPr>
-    </w:p>
-    <w:p>
-      <w:pPr>
-        <w:spacing w:after="0" w:line="240" w:lineRule="auto"/>
-        <w:rPr>
-          <w:rFonts w:ascii="Bookman Old Style" w:eastAsia="Bookman Old Style" w:hAnsi="Bookman Old Style" w:cs="Bookman Old Style"/>
-          <w:sz w:val="24"/>
-          <w:szCs w:val="24"/>
-        </w:rPr>
-      </w:pPr>
-      <w:r>
-        <w:rPr>
-          <w:rFonts w:ascii="Bookman Old Style" w:eastAsia="Bookman Old Style" w:hAnsi="Bookman Old Style" w:cs="Bookman Old Style"/>
-          <w:sz w:val="24"/>
-          <w:szCs w:val="24"/>
-        </w:rPr>
-        <w:t>To whom it may concern:</w:t>
-      </w:r>
-    </w:p>
-    <w:p>
-      <w:pPr>
-        <w:spacing w:after="0" w:line="240" w:lineRule="auto"/>
-        <w:rPr>
-          <w:rFonts w:ascii="Bookman Old Style" w:eastAsia="Bookman Old Style" w:hAnsi="Bookman Old Style" w:cs="Bookman Old Style"/>
-          <w:sz w:val="24"/>
-          <w:szCs w:val="24"/>
-        </w:rPr>
-      </w:pPr>
-    </w:p>
-    <w:p>
-      <w:pPr>
-        <w:spacing w:after="0" w:line="240" w:lineRule="auto"/>
-        <w:jc w:val="both"/>
-        <w:rPr>
-          <w:rFonts w:ascii="Bookman Old Style" w:eastAsia="Bookman Old Style" w:hAnsi="Bookman Old Style" w:cs="Bookman Old Style"/>
-          <w:sz w:val="24"/>
-          <w:szCs w:val="24"/>
-        </w:rPr>
-      </w:pPr>
-      <w:r>
-        <w:rPr>
-          <w:rFonts w:ascii="Bookman Old Style" w:eastAsia="Bookman Old Style" w:hAnsi="Bookman Old Style" w:cs="Bookman Old Style"/>
-          <w:sz w:val="24"/>
-          <w:szCs w:val="24"/>
-        </w:rPr>
-        <w:tab/>
-        <w:t xml:space="preserve">This is to certify that </w:t>
-      </w:r>
-      <w:r>
-        <w:rPr>
-          <w:rFonts w:ascii="Bookman Old Style" w:eastAsia="Bookman Old Style" w:hAnsi="Bookman Old Style" w:cs="Bookman Old Style"/>
-          <w:b/>
-          <w:bCs/>
-          <w:sz w:val="24"/>
-          <w:szCs w:val="24"/>
-        </w:rPr>
-        <w:t>AVRIL MAY M. GAMUTAN</w:t>
-      </w:r>
-      <w:r>
-        <w:rPr>
-          <w:rFonts w:ascii="Bookman Old Style" w:eastAsia="Bookman Old Style" w:hAnsi="Bookman Old Style" w:cs="Bookman Old Style"/>
-          <w:sz w:val="24"/>
-          <w:szCs w:val="24"/>
-        </w:rPr>
-        <w:t xml:space="preserve">, student from Our Lady of Fatima University has </w:t>
-      </w:r>
-      <w:r>
-        <w:rPr>
-          <w:rFonts w:ascii="Bookman Old Style" w:eastAsia="Bookman Old Style" w:hAnsi="Bookman Old Style" w:cs="Bookman Old Style"/>
-          <w:b/>
-          <w:bCs/>
-          <w:sz w:val="24"/>
-          <w:szCs w:val="24"/>
-        </w:rPr>
-        <w:t>SATISFACTORILY</w:t>
-      </w:r>
-      <w:r>
-        <w:rPr>
-          <w:rFonts w:ascii="Bookman Old Style" w:eastAsia="Bookman Old Style" w:hAnsi="Bookman Old Style" w:cs="Bookman Old Style"/>
-          <w:sz w:val="24"/>
-          <w:szCs w:val="24"/>
-        </w:rPr>
-        <w:t xml:space="preserve"> </w:t>
-      </w:r>
-      <w:r>
-        <w:rPr>
-          <w:rFonts w:ascii="Bookman Old Style" w:eastAsia="Bookman Old Style" w:hAnsi="Bookman Old Style" w:cs="Bookman Old Style"/>
-          <w:b/>
-          <w:bCs/>
-          <w:sz w:val="24"/>
-          <w:szCs w:val="24"/>
-        </w:rPr>
-        <w:t xml:space="preserve">COMPLETED </w:t>
-      </w:r>
-      <w:r>
-        <w:rPr>
-          <w:rFonts w:ascii="Bookman Old Style" w:eastAsia="Bookman Old Style" w:hAnsi="Bookman Old Style" w:cs="Bookman Old Style"/>
-          <w:sz w:val="24"/>
-          <w:szCs w:val="24"/>
-        </w:rPr>
-        <w:t xml:space="preserve">the </w:t>
-      </w:r>
-      <w:r>
-        <w:rPr>
-          <w:rFonts w:ascii="Bookman Old Style" w:eastAsia="Bookman Old Style" w:hAnsi="Bookman Old Style" w:cs="Bookman Old Style"/>
-          <w:b/>
-          <w:bCs/>
-          <w:sz w:val="24"/>
-          <w:szCs w:val="24"/>
-        </w:rPr>
-        <w:t>180-</w:t>
-      </w:r>
-      <w:proofErr w:type="gramStart"/>
-      <w:r>
-        <w:rPr>
-          <w:rFonts w:ascii="Bookman Old Style" w:eastAsia="Bookman Old Style" w:hAnsi="Bookman Old Style" w:cs="Bookman Old Style"/>
-          <w:b/>
-          <w:bCs/>
-          <w:sz w:val="24"/>
-          <w:szCs w:val="24"/>
-        </w:rPr>
-        <w:t xml:space="preserve">hours  </w:t>
-      </w:r>
-      <w:r>
-        <w:rPr>
-          <w:rFonts w:ascii="Bookman Old Style" w:eastAsia="Bookman Old Style" w:hAnsi="Bookman Old Style" w:cs="Bookman Old Style"/>
-          <w:sz w:val="24"/>
-          <w:szCs w:val="24"/>
-        </w:rPr>
-        <w:t>Public</w:t>
-      </w:r>
-      <w:proofErr w:type="gramEnd"/>
-      <w:r>
-        <w:rPr>
-          <w:rFonts w:ascii="Bookman Old Style" w:eastAsia="Bookman Old Style" w:hAnsi="Bookman Old Style" w:cs="Bookman Old Style"/>
-          <w:sz w:val="24"/>
-          <w:szCs w:val="24"/>
-        </w:rPr>
-        <w:t xml:space="preserve"> Health and Regulatory Pharmacy Internship in this Municipality particularly assigned at the </w:t>
-      </w:r>
-      <w:r>
-        <w:rPr>
-          <w:rFonts w:ascii="Bookman Old Style" w:eastAsia="Bookman Old Style" w:hAnsi="Bookman Old Style" w:cs="Bookman Old Style"/>
-          <w:b/>
-          <w:bCs/>
-          <w:sz w:val="24"/>
-          <w:szCs w:val="24"/>
-        </w:rPr>
-        <w:t xml:space="preserve">Municipal Health Office </w:t>
-      </w:r>
-      <w:r>
-        <w:rPr>
-          <w:rFonts w:ascii="Bookman Old Style" w:eastAsia="Bookman Old Style" w:hAnsi="Bookman Old Style" w:cs="Bookman Old Style"/>
-          <w:sz w:val="24"/>
-          <w:szCs w:val="24"/>
-        </w:rPr>
-        <w:t xml:space="preserve">from </w:t>
-      </w:r>
-      <w:r>
-        <w:rPr>
-          <w:rFonts w:ascii="Bookman Old Style" w:eastAsia="Bookman Old Style" w:hAnsi="Bookman Old Style" w:cs="Bookman Old Style"/>
-          <w:b/>
-          <w:bCs/>
-          <w:sz w:val="24"/>
-          <w:szCs w:val="24"/>
-        </w:rPr>
-        <w:t>July 29, 2025</w:t>
-      </w:r>
-      <w:r>
-        <w:rPr>
-          <w:rFonts w:ascii="Bookman Old Style" w:eastAsia="Bookman Old Style" w:hAnsi="Bookman Old Style" w:cs="Bookman Old Style"/>
-          <w:sz w:val="24"/>
-          <w:szCs w:val="24"/>
-        </w:rPr>
-        <w:t xml:space="preserve"> up to </w:t>
-      </w:r>
-      <w:r>
-        <w:rPr>
-          <w:rFonts w:ascii="Bookman Old Style" w:eastAsia="Bookman Old Style" w:hAnsi="Bookman Old Style" w:cs="Bookman Old Style"/>
-          <w:b/>
-          <w:bCs/>
-          <w:sz w:val="24"/>
-          <w:szCs w:val="24"/>
-        </w:rPr>
-        <w:t>September 16, 2025.</w:t>
-      </w:r>
-    </w:p>
-    <w:p>
-      <w:pPr>
-        <w:spacing w:after="0" w:line="240" w:lineRule="auto"/>
-        <w:rPr>
-          <w:rFonts w:ascii="Bookman Old Style" w:eastAsia="Bookman Old Style" w:hAnsi="Bookman Old Style" w:cs="Bookman Old Style"/>
-          <w:sz w:val="24"/>
-          <w:szCs w:val="24"/>
-        </w:rPr>
-      </w:pPr>
-    </w:p>
-    <w:p>
-      <w:pPr>
-        <w:spacing w:after="0" w:line="240" w:lineRule="auto"/>
-        <w:ind w:firstLine="720"/>
-        <w:jc w:val="both"/>
-        <w:rPr>
-          <w:rFonts w:ascii="Bookman Old Style" w:eastAsia="Bookman Old Style" w:hAnsi="Bookman Old Style" w:cs="Bookman Old Style"/>
-          <w:sz w:val="24"/>
-          <w:szCs w:val="24"/>
-        </w:rPr>
-      </w:pPr>
-      <w:r>
-        <w:rPr>
-          <w:rFonts w:ascii="Bookman Old Style" w:eastAsia="Bookman Old Style" w:hAnsi="Bookman Old Style" w:cs="Bookman Old Style"/>
-          <w:sz w:val="24"/>
-          <w:szCs w:val="24"/>
-        </w:rPr>
-        <w:t xml:space="preserve">This certification is issued upon the request of the above-named person for her </w:t>
-      </w:r>
-      <w:r>
-        <w:rPr>
-          <w:rFonts w:ascii="Bookman Old Style" w:eastAsia="Bookman Old Style" w:hAnsi="Bookman Old Style" w:cs="Bookman Old Style"/>
-          <w:b/>
-          <w:bCs/>
-          <w:sz w:val="24"/>
-          <w:szCs w:val="24"/>
-        </w:rPr>
-        <w:t xml:space="preserve">Internship Requirement </w:t>
-      </w:r>
-      <w:r>
-        <w:rPr>
-          <w:rFonts w:ascii="Bookman Old Style" w:eastAsia="Bookman Old Style" w:hAnsi="Bookman Old Style" w:cs="Bookman Old Style"/>
-          <w:sz w:val="24"/>
-          <w:szCs w:val="24"/>
-        </w:rPr>
-        <w:t>only.</w:t>
-      </w:r>
-    </w:p>
-    <w:p>
-      <w:pPr>
-        <w:spacing w:after="0" w:line="240" w:lineRule="auto"/>
-        <w:ind w:left="720"/>
-        <w:jc w:val="both"/>
-        <w:rPr>
-          <w:rFonts w:ascii="Bookman Old Style" w:eastAsia="Bookman Old Style" w:hAnsi="Bookman Old Style" w:cs="Bookman Old Style"/>
-          <w:sz w:val="24"/>
-          <w:szCs w:val="24"/>
-        </w:rPr>
-      </w:pPr>
-    </w:p>
-    <w:p>
-      <w:pPr>
-        <w:spacing w:after="0" w:line="240" w:lineRule="auto"/>
-        <w:ind w:left="720"/>
-        <w:jc w:val="both"/>
-        <w:rPr>
-          <w:rFonts w:ascii="Bookman Old Style" w:eastAsia="Bookman Old Style" w:hAnsi="Bookman Old Style" w:cs="Bookman Old Style"/>
-          <w:sz w:val="24"/>
-          <w:szCs w:val="24"/>
-        </w:rPr>
-      </w:pPr>
-      <w:r>
-        <w:rPr>
-          <w:rFonts w:ascii="Bookman Old Style" w:eastAsia="Bookman Old Style" w:hAnsi="Bookman Old Style" w:cs="Bookman Old Style"/>
-          <w:sz w:val="24"/>
-          <w:szCs w:val="24"/>
-        </w:rPr>
-        <w:t>ISSUED this 17</w:t>
-      </w:r>
-      <w:r>
-        <w:rPr>
-          <w:rFonts w:ascii="Bookman Old Style" w:eastAsia="Bookman Old Style" w:hAnsi="Bookman Old Style" w:cs="Bookman Old Style"/>
-          <w:sz w:val="24"/>
-          <w:szCs w:val="24"/>
-          <w:vertAlign w:val="superscript"/>
-        </w:rPr>
-        <w:t>th</w:t>
-      </w:r>
-      <w:r>
-        <w:rPr>
-          <w:rFonts w:ascii="Bookman Old Style" w:eastAsia="Bookman Old Style" w:hAnsi="Bookman Old Style" w:cs="Bookman Old Style"/>
-          <w:sz w:val="24"/>
-          <w:szCs w:val="24"/>
-        </w:rPr>
-        <w:t xml:space="preserve"> day of September 2025 at Rodriguez, Rizal.</w:t>
-      </w:r>
-    </w:p>
-    <w:p>
-      <w:pPr>
-        <w:spacing w:after="0" w:line="240" w:lineRule="auto"/>
-        <w:ind w:left="720"/>
-        <w:jc w:val="both"/>
-        <w:rPr>
-          <w:rFonts w:ascii="Bookman Old Style" w:eastAsia="Bookman Old Style" w:hAnsi="Bookman Old Style" w:cs="Bookman Old Style"/>
-          <w:sz w:val="24"/>
-          <w:szCs w:val="24"/>
-        </w:rPr>
-      </w:pPr>
-    </w:p>
-    <w:p>
-      <w:pPr>
-        <w:spacing w:after="0" w:line="240" w:lineRule="auto"/>
-        <w:ind w:left="720"/>
-        <w:jc w:val="both"/>
-        <w:rPr>
-          <w:rFonts w:ascii="Bookman Old Style" w:eastAsia="Bookman Old Style" w:hAnsi="Bookman Old Style" w:cs="Bookman Old Style"/>
-          <w:sz w:val="24"/>
-          <w:szCs w:val="24"/>
-        </w:rPr>
-      </w:pPr>
-    </w:p>
-    <w:p>
-      <w:pPr>
-        <w:spacing w:after="0" w:line="240" w:lineRule="auto"/>
-        <w:ind w:left="720"/>
-        <w:jc w:val="both"/>
-        <w:rPr>
-          <w:rFonts w:ascii="Bookman Old Style" w:eastAsia="Bookman Old Style" w:hAnsi="Bookman Old Style" w:cs="Bookman Old Style"/>
-          <w:sz w:val="24"/>
-          <w:szCs w:val="24"/>
-        </w:rPr>
-      </w:pPr>
-    </w:p>
-    <w:p>
-      <w:pPr>
-        <w:spacing w:after="0" w:line="240" w:lineRule="auto"/>
-        <w:ind w:left="720"/>
-        <w:jc w:val="both"/>
-        <w:rPr>
-          <w:rFonts w:ascii="Bookman Old Style" w:eastAsia="Bookman Old Style" w:hAnsi="Bookman Old Style" w:cs="Bookman Old Style"/>
-          <w:sz w:val="24"/>
-          <w:szCs w:val="24"/>
-        </w:rPr>
-      </w:pPr>
-    </w:p>
-    <w:p>
-      <w:pPr>
-        <w:spacing w:after="0" w:line="240" w:lineRule="auto"/>
-        <w:ind w:left="720"/>
-        <w:jc w:val="both"/>
-        <w:rPr>
-          <w:rFonts w:ascii="Bookman Old Style" w:eastAsia="Bookman Old Style" w:hAnsi="Bookman Old Style" w:cs="Bookman Old Style"/>
-          <w:b/>
-          <w:bCs/>
-          <w:sz w:val="24"/>
-          <w:szCs w:val="24"/>
-        </w:rPr>
-      </w:pPr>
-      <w:r>
-        <w:rPr>
-          <w:rFonts w:ascii="Bookman Old Style" w:eastAsia="Bookman Old Style" w:hAnsi="Bookman Old Style" w:cs="Bookman Old Style"/>
-          <w:sz w:val="24"/>
-          <w:szCs w:val="24"/>
-        </w:rPr>
-        <w:tab/>
-      </w:r>
-      <w:r>
-        <w:rPr>
-          <w:rFonts w:ascii="Bookman Old Style" w:eastAsia="Bookman Old Style" w:hAnsi="Bookman Old Style" w:cs="Bookman Old Style"/>
-          <w:sz w:val="24"/>
-          <w:szCs w:val="24"/>
-        </w:rPr>
-        <w:tab/>
-      </w:r>
-      <w:r>
-        <w:rPr>
-          <w:rFonts w:ascii="Bookman Old Style" w:eastAsia="Bookman Old Style" w:hAnsi="Bookman Old Style" w:cs="Bookman Old Style"/>
-          <w:sz w:val="24"/>
-          <w:szCs w:val="24"/>
-        </w:rPr>
-        <w:tab/>
-      </w:r>
-      <w:r>
-        <w:rPr>
-          <w:rFonts w:ascii="Bookman Old Style" w:eastAsia="Bookman Old Style" w:hAnsi="Bookman Old Style" w:cs="Bookman Old Style"/>
-          <w:sz w:val="24"/>
-          <w:szCs w:val="24"/>
-        </w:rPr>
-        <w:tab/>
-      </w:r>
-      <w:r>
-        <w:rPr>
-          <w:rFonts w:ascii="Bookman Old Style" w:eastAsia="Bookman Old Style" w:hAnsi="Bookman Old Style" w:cs="Bookman Old Style"/>
-          <w:sz w:val="24"/>
-          <w:szCs w:val="24"/>
-        </w:rPr>
-        <w:tab/>
-      </w:r>
-      <w:r>
-        <w:rPr>
-          <w:rFonts w:ascii="Bookman Old Style" w:eastAsia="Bookman Old Style" w:hAnsi="Bookman Old Style" w:cs="Bookman Old Style"/>
-          <w:sz w:val="24"/>
-          <w:szCs w:val="24"/>
-        </w:rPr>
-        <w:tab/>
-      </w:r>
-      <w:r>
-        <w:rPr>
-          <w:rFonts w:ascii="Bookman Old Style" w:eastAsia="Bookman Old Style" w:hAnsi="Bookman Old Style" w:cs="Bookman Old Style"/>
-          <w:sz w:val="24"/>
-          <w:szCs w:val="24"/>
-        </w:rPr>
-        <w:tab/>
-      </w:r>
-      <w:r>
-        <w:rPr>
-          <w:rFonts w:ascii="Bookman Old Style" w:eastAsia="Bookman Old Style" w:hAnsi="Bookman Old Style" w:cs="Bookman Old Style"/>
-          <w:sz w:val="24"/>
-          <w:szCs w:val="24"/>
-        </w:rPr>
-        <w:tab/>
-      </w:r>
-      <w:r>
-        <w:rPr>
-          <w:rFonts w:ascii="Bookman Old Style" w:eastAsia="Bookman Old Style" w:hAnsi="Bookman Old Style" w:cs="Bookman Old Style"/>
-          <w:b/>
-          <w:bCs/>
-          <w:sz w:val="24"/>
-          <w:szCs w:val="24"/>
-        </w:rPr>
-        <w:t>NOEL A. BROTONEL</w:t>
-      </w:r>
-    </w:p>
-    <w:p>
-      <w:pPr>
-        <w:spacing w:after="0" w:line="240" w:lineRule="auto"/>
-        <w:ind w:left="720"/>
-        <w:jc w:val="both"/>
-        <w:rPr>
-          <w:rFonts w:ascii="Bookman Old Style" w:eastAsia="Bookman Old Style" w:hAnsi="Bookman Old Style" w:cs="Bookman Old Style"/>
-          <w:sz w:val="24"/>
-          <w:szCs w:val="24"/>
-        </w:rPr>
-      </w:pPr>
-      <w:r>
-        <w:rPr>
-          <w:rFonts w:ascii="Bookman Old Style" w:eastAsia="Bookman Old Style" w:hAnsi="Bookman Old Style" w:cs="Bookman Old Style"/>
-          <w:sz w:val="24"/>
-          <w:szCs w:val="24"/>
-        </w:rPr>
-        <w:tab/>
-      </w:r>
-      <w:r>
-        <w:rPr>
-          <w:rFonts w:ascii="Bookman Old Style" w:eastAsia="Bookman Old Style" w:hAnsi="Bookman Old Style" w:cs="Bookman Old Style"/>
-          <w:sz w:val="24"/>
-          <w:szCs w:val="24"/>
-        </w:rPr>
-        <w:tab/>
-      </w:r>
-      <w:r>
-        <w:rPr>
-          <w:rFonts w:ascii="Bookman Old Style" w:eastAsia="Bookman Old Style" w:hAnsi="Bookman Old Style" w:cs="Bookman Old Style"/>
-          <w:sz w:val="24"/>
-          <w:szCs w:val="24"/>
-        </w:rPr>
-        <w:tab/>
-      </w:r>
-      <w:r>
-        <w:rPr>
-          <w:rFonts w:ascii="Bookman Old Style" w:eastAsia="Bookman Old Style" w:hAnsi="Bookman Old Style" w:cs="Bookman Old Style"/>
-          <w:sz w:val="24"/>
-          <w:szCs w:val="24"/>
-        </w:rPr>
-        <w:tab/>
-      </w:r>
-      <w:r>
-        <w:rPr>
-          <w:rFonts w:ascii="Bookman Old Style" w:eastAsia="Bookman Old Style" w:hAnsi="Bookman Old Style" w:cs="Bookman Old Style"/>
-          <w:sz w:val="24"/>
-          <w:szCs w:val="24"/>
-        </w:rPr>
-        <w:tab/>
-      </w:r>
-      <w:r>
-        <w:rPr>
-          <w:rFonts w:ascii="Bookman Old Style" w:eastAsia="Bookman Old Style" w:hAnsi="Bookman Old Style" w:cs="Bookman Old Style"/>
-          <w:sz w:val="24"/>
-          <w:szCs w:val="24"/>
-        </w:rPr>
-        <w:tab/>
-      </w:r>
-      <w:r>
-        <w:rPr>
-          <w:rFonts w:ascii="Bookman Old Style" w:eastAsia="Bookman Old Style" w:hAnsi="Bookman Old Style" w:cs="Bookman Old Style"/>
-          <w:sz w:val="24"/>
-          <w:szCs w:val="24"/>
-        </w:rPr>
-        <w:tab/>
-        <w:t xml:space="preserve">       </w:t>
-      </w:r>
-      <w:r>
-        <w:rPr>
-          <w:rFonts w:ascii="Bookman Old Style" w:eastAsia="Bookman Old Style" w:hAnsi="Bookman Old Style" w:cs="Bookman Old Style"/>
-          <w:sz w:val="24"/>
-          <w:szCs w:val="24"/>
-        </w:rPr>
-        <w:tab/>
-        <w:t xml:space="preserve">    MGDH I -HRMO</w:t>
-      </w:r>
-    </w:p>
-    <w:p>
-      <w:pPr>
-        <w:spacing w:after="0" w:line="240" w:lineRule="auto"/>
-        <w:jc w:val="both"/>
-        <w:rPr>
-          <w:rFonts w:ascii="Bookman Old Style" w:eastAsia="Bookman Old Style" w:hAnsi="Bookman Old Style" w:cs="Bookman Old Style"/>
-          <w:sz w:val="24"/>
-          <w:szCs w:val="24"/>
-        </w:rPr>
-      </w:pPr>
-    </w:p>
-    <w:p/>
-    <w:p/>
-    <w:p/>
-    <w:p/>
-    <w:p/>
-    <w:p/>
-    <w:p/>
-    <w:p>
-      <w:pPr>
-        <w:spacing w:after="0" w:line="240" w:lineRule="auto"/>
-      </w:pPr>
-      <w:r>
-        <w:t>/</w:t>
-      </w:r>
-      <w:proofErr w:type="spellStart"/>
-      <w:proofErr w:type="gramStart"/>
-      <w:r>
-        <w:t>gdjv</w:t>
-      </w:r>
-      <w:proofErr w:type="spellEnd"/>
-      <w:proofErr w:type="gramEnd"/>
-    </w:p>
-    <w:p>
-      <w:r>
-        <w:t>9.17.2025</w:t>
-      </w:r>
     </w:p>
     <w:sectPr>
       <w:headerReference w:type="default" r:id="rId6"/>
@@ -2427,6 +1801,7 @@
   <w:style w:type="character" w:default="1" w:styleId="DefaultParagraphFont">
     <w:name w:val="Default Paragraph Font"/>
     <w:uiPriority w:val="1"/>
+    <w:semiHidden/>
     <w:unhideWhenUsed/>
   </w:style>
   <w:style w:type="table" w:default="1" w:styleId="TableNormal">

</xml_diff>